<commit_message>
Add timing note to the top of the Week 1 Word report
</commit_message>
<xml_diff>
--- a/week-1-secure-onboarding/docs/Discovery Report.docx
+++ b/week-1-secure-onboarding/docs/Discovery Report.docx
@@ -225,6 +225,18 @@
     <w:p>
       <w:r>
         <w:t> </w:t>
+      </w:r>
+    </w:p>
+    <w:p>
+      <w:r>
+        <w:rPr>
+          <w:b/>
+          <w:bCs/>
+        </w:rPr>
+        <w:t xml:space="preserve">Note:</w:t>
+      </w:r>
+      <w:r>
+        <w:t xml:space="preserve"> this report was completed after the Week 1 build, using what was learned during it.</w:t>
       </w:r>
     </w:p>
     <w:p>

</xml_diff>